<commit_message>
Update legal document templates for vehicle usage contracts
Updates the .docx templates for both new and used vehicle usage agreements, including gender-specific and plural variations.
</commit_message>
<xml_diff>
--- a/apps/legal-docs-blueprints/templates/contrato_uso_carro_usado/contrato_uso_carro_usado.docx
+++ b/apps/legal-docs-blueprints/templates/contrato_uso_carro_usado/contrato_uso_carro_usado.docx
@@ -603,64 +603,321 @@
     </w:p>
     <w:p>
       <w:pPr>
-        <w:pStyle w:val="Normal"/>
-        <w:widowControl w:val="false"/>
-        <w:ind w:hanging="2" w:left="0" w:right="-28"/>
-        <w:jc w:val="both"/>
-        <w:rPr>
-          <w:rFonts w:ascii="Calibri" w:hAnsi="Calibri" w:eastAsia="Calibri" w:cs="Calibri"/>
-          <w:sz w:val="21"/>
-          <w:szCs w:val="21"/>
-        </w:rPr>
-      </w:pPr>
-      <w:r>
-        <w:rPr>
-          <w:rFonts w:eastAsia="Calibri" w:cs="Calibri" w:ascii="Calibri" w:hAnsi="Calibri"/>
-          <w:sz w:val="21"/>
-          <w:szCs w:val="21"/>
+        <w:pStyle w:val="BodyText"/>
+        <w:widowControl w:val="false"/>
+        <w:ind w:hanging="2" w:left="0" w:right="-28"/>
+        <w:jc w:val="both"/>
+        <w:rPr>
+          <w:rFonts w:ascii="Calibri" w:hAnsi="Calibri" w:eastAsia="Calibri" w:cs="Calibri"/>
+          <w:sz w:val="21"/>
+          <w:szCs w:val="21"/>
+        </w:rPr>
+      </w:pPr>
+      <w:bookmarkStart w:id="1" w:name="docs-internal-guid-6244adf3-7fff-25fb-d2"/>
+      <w:bookmarkEnd w:id="1"/>
+      <w:r>
+        <w:rPr>
+          <w:rFonts w:eastAsia="Calibri" w:cs="Calibri" w:ascii="Calibri" w:hAnsi="Calibri"/>
+          <w:b w:val="false"/>
+          <w:i w:val="false"/>
+          <w:caps w:val="false"/>
+          <w:smallCaps w:val="false"/>
+          <w:strike w:val="false"/>
+          <w:dstrike w:val="false"/>
+          <w:color w:val="000000"/>
+          <w:sz w:val="21"/>
+          <w:szCs w:val="21"/>
+          <w:u w:val="none"/>
+          <w:effect w:val="none"/>
+          <w:shd w:fill="auto" w:val="clear"/>
         </w:rPr>
         <w:t>El USUARIO reconoce que la vigencia del presente contrato de uso se encuentra directamente vinculada a la vigencia y cumplimiento de la relación económica subyacente contraída a través de Cube Investments, Sociedad Anónima.</w:t>
       </w:r>
     </w:p>
     <w:p>
       <w:pPr>
-        <w:pStyle w:val="Normal"/>
-        <w:widowControl w:val="false"/>
-        <w:ind w:hanging="2" w:left="0" w:right="-28"/>
-        <w:jc w:val="both"/>
-        <w:rPr>
-          <w:rFonts w:ascii="Calibri" w:hAnsi="Calibri" w:eastAsia="Calibri" w:cs="Calibri"/>
-          <w:sz w:val="21"/>
-          <w:szCs w:val="21"/>
-        </w:rPr>
-      </w:pPr>
-      <w:r>
-        <w:rPr>
-          <w:rFonts w:eastAsia="Calibri" w:cs="Calibri" w:ascii="Calibri" w:hAnsi="Calibri"/>
-          <w:sz w:val="21"/>
-          <w:szCs w:val="21"/>
+        <w:pStyle w:val="BodyText"/>
+        <w:widowControl w:val="false"/>
+        <w:ind w:hanging="2" w:left="0" w:right="-28"/>
+        <w:jc w:val="both"/>
+        <w:rPr>
+          <w:rFonts w:ascii="Calibri" w:hAnsi="Calibri" w:eastAsia="Calibri" w:cs="Calibri"/>
+          <w:sz w:val="21"/>
+          <w:szCs w:val="21"/>
+        </w:rPr>
+      </w:pPr>
+      <w:r>
+        <w:rPr/>
+      </w:r>
+    </w:p>
+    <w:p>
+      <w:pPr>
+        <w:pStyle w:val="BodyText"/>
+        <w:pBdr/>
+        <w:bidi w:val="0"/>
+        <w:spacing w:lineRule="auto" w:line="288" w:before="0" w:after="0"/>
+        <w:ind w:hanging="2" w:left="0" w:right="0"/>
+        <w:rPr>
+          <w:rFonts w:ascii="Calibri;sans-serif" w:hAnsi="Calibri;sans-serif"/>
+          <w:b w:val="false"/>
+          <w:i w:val="false"/>
+          <w:caps w:val="false"/>
+          <w:smallCaps w:val="false"/>
+          <w:strike w:val="false"/>
+          <w:dstrike w:val="false"/>
+          <w:color w:val="000000"/>
+          <w:sz w:val="21"/>
+          <w:u w:val="none"/>
+          <w:effect w:val="none"/>
+          <w:shd w:fill="auto" w:val="clear"/>
+        </w:rPr>
+      </w:pPr>
+      <w:r>
+        <w:rPr>
+          <w:rFonts w:ascii="Calibri;sans-serif" w:hAnsi="Calibri;sans-serif"/>
+          <w:b w:val="false"/>
+          <w:i w:val="false"/>
+          <w:caps w:val="false"/>
+          <w:smallCaps w:val="false"/>
+          <w:strike w:val="false"/>
+          <w:dstrike w:val="false"/>
+          <w:color w:val="000000"/>
+          <w:sz w:val="21"/>
+          <w:u w:val="none"/>
+          <w:effect w:val="none"/>
+          <w:shd w:fill="auto" w:val="clear"/>
+        </w:rPr>
+        <w:t xml:space="preserve">En tal virtud, el derecho de uso objeto del presente contrato se concederá por un plazo de </w:t>
+      </w:r>
+      <w:r>
+        <w:rPr>
+          <w:rFonts w:ascii="Calibri;sans-serif" w:hAnsi="Calibri;sans-serif"/>
+          <w:b w:val="false"/>
+          <w:i w:val="false"/>
+          <w:caps w:val="false"/>
+          <w:smallCaps w:val="false"/>
+          <w:strike w:val="false"/>
+          <w:dstrike w:val="false"/>
+          <w:color w:val="000000"/>
+          <w:sz w:val="21"/>
+          <w:u w:val="none"/>
+          <w:effect w:val="none"/>
+          <w:shd w:fill="auto" w:val="clear"/>
+        </w:rPr>
+        <w:t>{plazoTexto}</w:t>
+      </w:r>
+      <w:r>
+        <w:rPr>
+          <w:rFonts w:ascii="Calibri;sans-serif" w:hAnsi="Calibri;sans-serif"/>
+          <w:b w:val="false"/>
+          <w:i w:val="false"/>
+          <w:caps w:val="false"/>
+          <w:smallCaps w:val="false"/>
+          <w:strike w:val="false"/>
+          <w:dstrike w:val="false"/>
+          <w:color w:val="000000"/>
+          <w:sz w:val="21"/>
+          <w:u w:val="none"/>
+          <w:effect w:val="none"/>
+          <w:shd w:fill="auto" w:val="clear"/>
+        </w:rPr>
+        <w:t xml:space="preserve"> meses, contados a partir del </w:t>
+      </w:r>
+      <w:r>
+        <w:rPr>
+          <w:rFonts w:ascii="Calibri;sans-serif" w:hAnsi="Calibri;sans-serif"/>
+          <w:b w:val="false"/>
+          <w:i w:val="false"/>
+          <w:caps w:val="false"/>
+          <w:smallCaps w:val="false"/>
+          <w:strike w:val="false"/>
+          <w:dstrike w:val="false"/>
+          <w:color w:val="000000"/>
+          <w:sz w:val="21"/>
+          <w:u w:val="none"/>
+          <w:effect w:val="none"/>
+          <w:shd w:fill="auto" w:val="clear"/>
+        </w:rPr>
+        <w:t>{fechaInicioContrato}</w:t>
+      </w:r>
+      <w:r>
+        <w:rPr>
+          <w:rFonts w:ascii="Calibri;sans-serif" w:hAnsi="Calibri;sans-serif"/>
+          <w:b w:val="false"/>
+          <w:i w:val="false"/>
+          <w:caps w:val="false"/>
+          <w:smallCaps w:val="false"/>
+          <w:strike w:val="false"/>
+          <w:dstrike w:val="false"/>
+          <w:color w:val="000000"/>
+          <w:sz w:val="21"/>
+          <w:u w:val="none"/>
+          <w:effect w:val="none"/>
+          <w:shd w:fill="auto" w:val="clear"/>
+        </w:rPr>
+        <w:t xml:space="preserve">, no obstante, para efectos de uso efectivo del vehículo, el derecho de uso se otorga a partir del día en que se suscribe el presente documento; en consecuencia, el vencimiento será el día </w:t>
+      </w:r>
+      <w:r>
+        <w:rPr>
+          <w:rFonts w:ascii="Calibri;sans-serif" w:hAnsi="Calibri;sans-serif"/>
+          <w:b w:val="false"/>
+          <w:i w:val="false"/>
+          <w:caps w:val="false"/>
+          <w:smallCaps w:val="false"/>
+          <w:strike w:val="false"/>
+          <w:dstrike w:val="false"/>
+          <w:color w:val="000000"/>
+          <w:sz w:val="21"/>
+          <w:u w:val="none"/>
+          <w:effect w:val="none"/>
+          <w:shd w:fill="auto" w:val="clear"/>
+        </w:rPr>
+        <w:t>{diaTextoVencimiento}</w:t>
+      </w:r>
+      <w:r>
+        <w:rPr>
+          <w:rFonts w:ascii="Calibri;sans-serif" w:hAnsi="Calibri;sans-serif"/>
+          <w:b w:val="false"/>
+          <w:i w:val="false"/>
+          <w:caps w:val="false"/>
+          <w:smallCaps w:val="false"/>
+          <w:strike w:val="false"/>
+          <w:dstrike w:val="false"/>
+          <w:color w:val="000000"/>
+          <w:sz w:val="21"/>
+          <w:u w:val="none"/>
+          <w:effect w:val="none"/>
+          <w:shd w:fill="auto" w:val="clear"/>
+        </w:rPr>
+        <w:t xml:space="preserve"> de </w:t>
+      </w:r>
+      <w:r>
+        <w:rPr>
+          <w:rFonts w:ascii="Calibri;sans-serif" w:hAnsi="Calibri;sans-serif"/>
+          <w:b w:val="false"/>
+          <w:i w:val="false"/>
+          <w:caps w:val="false"/>
+          <w:smallCaps w:val="false"/>
+          <w:strike w:val="false"/>
+          <w:dstrike w:val="false"/>
+          <w:color w:val="000000"/>
+          <w:sz w:val="21"/>
+          <w:u w:val="none"/>
+          <w:effect w:val="none"/>
+          <w:shd w:fill="auto" w:val="clear"/>
+        </w:rPr>
+        <w:t>{mesTextoVencimiento}</w:t>
+      </w:r>
+      <w:r>
+        <w:rPr>
+          <w:rFonts w:ascii="Calibri;sans-serif" w:hAnsi="Calibri;sans-serif"/>
+          <w:b w:val="false"/>
+          <w:i w:val="false"/>
+          <w:caps w:val="false"/>
+          <w:smallCaps w:val="false"/>
+          <w:strike w:val="false"/>
+          <w:dstrike w:val="false"/>
+          <w:color w:val="000000"/>
+          <w:sz w:val="21"/>
+          <w:u w:val="none"/>
+          <w:effect w:val="none"/>
+          <w:shd w:fill="auto" w:val="clear"/>
+        </w:rPr>
+        <w:t xml:space="preserve"> del año dos mil </w:t>
+      </w:r>
+      <w:r>
+        <w:rPr>
+          <w:rFonts w:ascii="Calibri;sans-serif" w:hAnsi="Calibri;sans-serif"/>
+          <w:b w:val="false"/>
+          <w:i w:val="false"/>
+          <w:caps w:val="false"/>
+          <w:smallCaps w:val="false"/>
+          <w:strike w:val="false"/>
+          <w:dstrike w:val="false"/>
+          <w:color w:val="000000"/>
+          <w:sz w:val="21"/>
+          <w:u w:val="none"/>
+          <w:effect w:val="none"/>
+          <w:shd w:fill="auto" w:val="clear"/>
+        </w:rPr>
+        <w:t>{anoTextoVencimiento}</w:t>
+      </w:r>
+      <w:r>
+        <w:rPr>
+          <w:rFonts w:ascii="Calibri;sans-serif" w:hAnsi="Calibri;sans-serif"/>
+          <w:b w:val="false"/>
+          <w:i w:val="false"/>
+          <w:caps w:val="false"/>
+          <w:smallCaps w:val="false"/>
+          <w:strike w:val="false"/>
+          <w:dstrike w:val="false"/>
+          <w:color w:val="000000"/>
+          <w:sz w:val="21"/>
+          <w:u w:val="none"/>
+          <w:effect w:val="none"/>
+          <w:shd w:fill="auto" w:val="clear"/>
+        </w:rPr>
+        <w:t>.</w:t>
+      </w:r>
+    </w:p>
+    <w:p>
+      <w:pPr>
+        <w:pStyle w:val="BodyText"/>
+        <w:ind w:hanging="1" w:left="65535" w:right="0"/>
+        <w:rPr/>
+      </w:pPr>
+      <w:r>
+        <w:rPr/>
+      </w:r>
+    </w:p>
+    <w:p>
+      <w:pPr>
+        <w:pStyle w:val="BodyText"/>
+        <w:pBdr/>
+        <w:bidi w:val="0"/>
+        <w:spacing w:lineRule="auto" w:line="288" w:before="0" w:after="0"/>
+        <w:ind w:hanging="2" w:left="0" w:right="0"/>
+        <w:rPr>
+          <w:rFonts w:ascii="Calibri;sans-serif" w:hAnsi="Calibri;sans-serif"/>
+          <w:b w:val="false"/>
+          <w:i w:val="false"/>
+          <w:caps w:val="false"/>
+          <w:smallCaps w:val="false"/>
+          <w:strike w:val="false"/>
+          <w:dstrike w:val="false"/>
+          <w:color w:val="000000"/>
+          <w:sz w:val="21"/>
+          <w:u w:val="none"/>
+          <w:effect w:val="none"/>
+          <w:shd w:fill="auto" w:val="clear"/>
+        </w:rPr>
+      </w:pPr>
+      <w:r>
+        <w:rPr>
+          <w:rFonts w:ascii="Calibri;sans-serif" w:hAnsi="Calibri;sans-serif"/>
+          <w:b w:val="false"/>
+          <w:i w:val="false"/>
+          <w:caps w:val="false"/>
+          <w:smallCaps w:val="false"/>
+          <w:strike w:val="false"/>
+          <w:dstrike w:val="false"/>
+          <w:color w:val="000000"/>
+          <w:sz w:val="21"/>
+          <w:u w:val="none"/>
+          <w:effect w:val="none"/>
+          <w:shd w:fill="auto" w:val="clear"/>
         </w:rPr>
         <w:t>En consecuencia, la extinción del plazo contractual no libera al USUARIO de la obligación de devolver el vehículo, ni le confiere derecho alguno de retención, mientras existan obligaciones económicas, gastos, daños o responsabilidades pendientes.</w:t>
       </w:r>
     </w:p>
     <w:p>
       <w:pPr>
-        <w:pStyle w:val="Normal"/>
-        <w:widowControl w:val="false"/>
-        <w:ind w:hanging="2" w:left="0" w:right="-28"/>
-        <w:jc w:val="both"/>
-        <w:rPr>
-          <w:rFonts w:ascii="Calibri" w:hAnsi="Calibri" w:eastAsia="Calibri" w:cs="Calibri"/>
-          <w:sz w:val="21"/>
-          <w:szCs w:val="21"/>
-        </w:rPr>
-      </w:pPr>
-      <w:r>
-        <w:rPr>
-          <w:rFonts w:eastAsia="Calibri" w:cs="Calibri" w:ascii="Calibri" w:hAnsi="Calibri"/>
-          <w:sz w:val="21"/>
-          <w:szCs w:val="21"/>
-        </w:rPr>
+        <w:pStyle w:val="BodyText"/>
+        <w:ind w:hanging="1" w:left="65535" w:right="0"/>
+        <w:rPr/>
+      </w:pPr>
+      <w:r>
+        <w:rPr/>
       </w:r>
     </w:p>
     <w:p>
@@ -3164,9 +3421,9 @@
           <w:szCs w:val="21"/>
         </w:rPr>
       </w:r>
-      <w:bookmarkStart w:id="1" w:name="_heading=h.r64nq4dw57hg"/>
       <w:bookmarkStart w:id="2" w:name="_heading=h.r64nq4dw57hg"/>
-      <w:bookmarkEnd w:id="2"/>
+      <w:bookmarkStart w:id="3" w:name="_heading=h.r64nq4dw57hg"/>
+      <w:bookmarkEnd w:id="3"/>
     </w:p>
     <w:p>
       <w:pPr>
@@ -3207,9 +3464,9 @@
           <w:szCs w:val="21"/>
         </w:rPr>
       </w:r>
-      <w:bookmarkStart w:id="3" w:name="_GoBack"/>
       <w:bookmarkStart w:id="4" w:name="_GoBack"/>
-      <w:bookmarkEnd w:id="4"/>
+      <w:bookmarkStart w:id="5" w:name="_GoBack"/>
+      <w:bookmarkEnd w:id="5"/>
     </w:p>
     <w:p>
       <w:pPr>

</xml_diff>